<commit_message>
i think program is done ;-)
</commit_message>
<xml_diff>
--- a/Program4/docs/Program4_Group1_Tasklist.docx
+++ b/Program4/docs/Program4_Group1_Tasklist.docx
@@ -113,31 +113,13 @@
           </w:tcPr>
           <w:p>
             <w:r>
-              <w:t>Created documents/</w:t>
-            </w:r>
-            <w:proofErr w:type="spellStart"/>
-            <w:r>
-              <w:t>tasklist</w:t>
-            </w:r>
-            <w:proofErr w:type="spellEnd"/>
-          </w:p>
-          <w:p>
-            <w:r>
-              <w:t xml:space="preserve">Began code in </w:t>
-            </w:r>
-            <w:proofErr w:type="spellStart"/>
-            <w:r>
-              <w:t>action.c</w:t>
-            </w:r>
-            <w:proofErr w:type="spellEnd"/>
-            <w:r>
-              <w:t>/</w:t>
-            </w:r>
-            <w:proofErr w:type="spellStart"/>
-            <w:r>
-              <w:t>action.h</w:t>
-            </w:r>
-            <w:proofErr w:type="spellEnd"/>
+              <w:t>Created documents/tasklist</w:t>
+            </w:r>
+          </w:p>
+          <w:p>
+            <w:r>
+              <w:t>Began code in action.c/action.h</w:t>
+            </w:r>
           </w:p>
         </w:tc>
       </w:tr>
@@ -168,21 +150,8 @@
           </w:tcPr>
           <w:p>
             <w:r>
-              <w:t xml:space="preserve">More code in </w:t>
-            </w:r>
-            <w:proofErr w:type="spellStart"/>
-            <w:r>
-              <w:t>action.c</w:t>
-            </w:r>
-            <w:proofErr w:type="spellEnd"/>
-            <w:r>
-              <w:t>/</w:t>
-            </w:r>
-            <w:proofErr w:type="spellStart"/>
-            <w:r>
-              <w:t>action.h</w:t>
-            </w:r>
-            <w:proofErr w:type="spellEnd"/>
+              <w:t>More code in action.c/action.h</w:t>
+            </w:r>
           </w:p>
         </w:tc>
       </w:tr>
@@ -214,6 +183,38 @@
           <w:p>
             <w:r>
               <w:t>Fix returns, add c file open, display time in LIS, group header, revisions</w:t>
+            </w:r>
+          </w:p>
+        </w:tc>
+      </w:tr>
+      <w:tr>
+        <w:tc>
+          <w:tcPr>
+            <w:tcW w:w="3116" w:type="dxa"/>
+          </w:tcPr>
+          <w:p>
+            <w:r>
+              <w:t>Luke</w:t>
+            </w:r>
+          </w:p>
+        </w:tc>
+        <w:tc>
+          <w:tcPr>
+            <w:tcW w:w="3117" w:type="dxa"/>
+          </w:tcPr>
+          <w:p>
+            <w:r>
+              <w:t>4/19/26</w:t>
+            </w:r>
+          </w:p>
+        </w:tc>
+        <w:tc>
+          <w:tcPr>
+            <w:tcW w:w="3117" w:type="dxa"/>
+          </w:tcPr>
+          <w:p>
+            <w:r>
+              <w:t>Worked on program</w:t>
             </w:r>
           </w:p>
         </w:tc>

</xml_diff>

<commit_message>
the output for loops just not right
</commit_message>
<xml_diff>
--- a/Program4/docs/Program4_Group1_Tasklist.docx
+++ b/Program4/docs/Program4_Group1_Tasklist.docx
@@ -113,13 +113,31 @@
           </w:tcPr>
           <w:p>
             <w:r>
-              <w:t>Created documents/tasklist</w:t>
-            </w:r>
-          </w:p>
-          <w:p>
-            <w:r>
-              <w:t>Began code in action.c/action.h</w:t>
-            </w:r>
+              <w:t>Created documents/</w:t>
+            </w:r>
+            <w:proofErr w:type="spellStart"/>
+            <w:r>
+              <w:t>tasklist</w:t>
+            </w:r>
+            <w:proofErr w:type="spellEnd"/>
+          </w:p>
+          <w:p>
+            <w:r>
+              <w:t xml:space="preserve">Began code in </w:t>
+            </w:r>
+            <w:proofErr w:type="spellStart"/>
+            <w:r>
+              <w:t>action.c</w:t>
+            </w:r>
+            <w:proofErr w:type="spellEnd"/>
+            <w:r>
+              <w:t>/</w:t>
+            </w:r>
+            <w:proofErr w:type="spellStart"/>
+            <w:r>
+              <w:t>action.h</w:t>
+            </w:r>
+            <w:proofErr w:type="spellEnd"/>
           </w:p>
         </w:tc>
       </w:tr>
@@ -150,8 +168,21 @@
           </w:tcPr>
           <w:p>
             <w:r>
-              <w:t>More code in action.c/action.h</w:t>
-            </w:r>
+              <w:t xml:space="preserve">More code in </w:t>
+            </w:r>
+            <w:proofErr w:type="spellStart"/>
+            <w:r>
+              <w:t>action.c</w:t>
+            </w:r>
+            <w:proofErr w:type="spellEnd"/>
+            <w:r>
+              <w:t>/</w:t>
+            </w:r>
+            <w:proofErr w:type="spellStart"/>
+            <w:r>
+              <w:t>action.h</w:t>
+            </w:r>
+            <w:proofErr w:type="spellEnd"/>
           </w:p>
         </w:tc>
       </w:tr>
@@ -215,6 +246,38 @@
           <w:p>
             <w:r>
               <w:t>Worked on program</w:t>
+            </w:r>
+          </w:p>
+        </w:tc>
+      </w:tr>
+      <w:tr>
+        <w:tc>
+          <w:tcPr>
+            <w:tcW w:w="3116" w:type="dxa"/>
+          </w:tcPr>
+          <w:p>
+            <w:r>
+              <w:t xml:space="preserve">Margo </w:t>
+            </w:r>
+          </w:p>
+        </w:tc>
+        <w:tc>
+          <w:tcPr>
+            <w:tcW w:w="3117" w:type="dxa"/>
+          </w:tcPr>
+          <w:p>
+            <w:r>
+              <w:t>4/20/26</w:t>
+            </w:r>
+          </w:p>
+        </w:tc>
+        <w:tc>
+          <w:tcPr>
+            <w:tcW w:w="3117" w:type="dxa"/>
+          </w:tcPr>
+          <w:p>
+            <w:r>
+              <w:t>Final review and submission</w:t>
             </w:r>
           </w:p>
         </w:tc>
@@ -245,12 +308,12 @@
     </w:tbl>
     <w:p/>
     <w:sectPr>
-      <w:headerReference w:type="even" r:id="rId7"/>
-      <w:headerReference w:type="default" r:id="rId8"/>
-      <w:footerReference w:type="even" r:id="rId9"/>
-      <w:footerReference w:type="default" r:id="rId10"/>
-      <w:headerReference w:type="first" r:id="rId11"/>
-      <w:footerReference w:type="first" r:id="rId12"/>
+      <w:headerReference w:type="even" r:id="rId8"/>
+      <w:headerReference w:type="default" r:id="rId9"/>
+      <w:footerReference w:type="even" r:id="rId10"/>
+      <w:footerReference w:type="default" r:id="rId11"/>
+      <w:headerReference w:type="first" r:id="rId12"/>
+      <w:footerReference w:type="first" r:id="rId13"/>
       <w:pgSz w:w="12240" w:h="15840"/>
       <w:pgMar w:top="1440" w:right="1440" w:bottom="1440" w:left="1440" w:header="720" w:footer="720" w:gutter="0"/>
       <w:cols w:space="720"/>
@@ -392,6 +455,126 @@
     </w:pPr>
   </w:p>
 </w:hdr>
+</file>
+
+<file path=word/numbering.xml><?xml version="1.0" encoding="utf-8"?>
+<w:numbering xmlns:wpc="http://schemas.microsoft.com/office/word/2010/wordprocessingCanvas" xmlns:cx="http://schemas.microsoft.com/office/drawing/2014/chartex" xmlns:cx1="http://schemas.microsoft.com/office/drawing/2015/9/8/chartex" xmlns:cx2="http://schemas.microsoft.com/office/drawing/2015/10/21/chartex" xmlns:cx3="http://schemas.microsoft.com/office/drawing/2016/5/9/chartex" xmlns:cx4="http://schemas.microsoft.com/office/drawing/2016/5/10/chartex" xmlns:cx5="http://schemas.microsoft.com/office/drawing/2016/5/11/chartex" xmlns:cx6="http://schemas.microsoft.com/office/drawing/2016/5/12/chartex" xmlns:cx7="http://schemas.microsoft.com/office/drawing/2016/5/13/chartex" xmlns:cx8="http://schemas.microsoft.com/office/drawing/2016/5/14/chartex" xmlns:mc="http://schemas.openxmlformats.org/markup-compatibility/2006" xmlns:aink="http://schemas.microsoft.com/office/drawing/2016/ink" xmlns:am3d="http://schemas.microsoft.com/office/drawing/2017/model3d" xmlns:o="urn:schemas-microsoft-com:office:office" xmlns:oel="http://schemas.microsoft.com/office/2019/extlst" xmlns:r="http://schemas.openxmlformats.org/officeDocument/2006/relationships" xmlns:m="http://schemas.openxmlformats.org/officeDocument/2006/math" xmlns:v="urn:schemas-microsoft-com:vml" xmlns:wp14="http://schemas.microsoft.com/office/word/2010/wordprocessingDrawing" xmlns:wp="http://schemas.openxmlformats.org/drawingml/2006/wordprocessingDrawing" xmlns:w10="urn:schemas-microsoft-com:office:word" xmlns:w="http://schemas.openxmlformats.org/wordprocessingml/2006/main" xmlns:w14="http://schemas.microsoft.com/office/word/2010/wordml" xmlns:w15="http://schemas.microsoft.com/office/word/2012/wordml" xmlns:w16cex="http://schemas.microsoft.com/office/word/2018/wordml/cex" xmlns:w16cid="http://schemas.microsoft.com/office/word/2016/wordml/cid" xmlns:w16="http://schemas.microsoft.com/office/word/2018/wordml" xmlns:w16du="http://schemas.microsoft.com/office/word/2023/wordml/word16du" xmlns:w16sdtdh="http://schemas.microsoft.com/office/word/2020/wordml/sdtdatahash" xmlns:w16sdtfl="http://schemas.microsoft.com/office/word/2024/wordml/sdtformatlock" xmlns:w16se="http://schemas.microsoft.com/office/word/2015/wordml/symex" xmlns:wpg="http://schemas.microsoft.com/office/word/2010/wordprocessingGroup" xmlns:wpi="http://schemas.microsoft.com/office/word/2010/wordprocessingInk" xmlns:wne="http://schemas.microsoft.com/office/word/2006/wordml" xmlns:wps="http://schemas.microsoft.com/office/word/2010/wordprocessingShape" mc:Ignorable="w14 w15 w16se w16cid w16 w16cex w16sdtdh w16sdtfl w16du wp14">
+  <w:abstractNum w:abstractNumId="0" w15:restartNumberingAfterBreak="0">
+    <w:nsid w:val="01BC43CF"/>
+    <w:multiLevelType w:val="hybridMultilevel"/>
+    <w:tmpl w:val="CCF09D48"/>
+    <w:lvl w:ilvl="0" w:tplc="4DDC702C">
+      <w:numFmt w:val="bullet"/>
+      <w:lvlText w:val="-"/>
+      <w:lvlJc w:val="left"/>
+      <w:pPr>
+        <w:ind w:left="720" w:hanging="360"/>
+      </w:pPr>
+      <w:rPr>
+        <w:rFonts w:ascii="Calibri" w:eastAsiaTheme="minorHAnsi" w:hAnsi="Calibri" w:cs="Calibri" w:hint="default"/>
+      </w:rPr>
+    </w:lvl>
+    <w:lvl w:ilvl="1" w:tplc="04090003" w:tentative="1">
+      <w:start w:val="1"/>
+      <w:numFmt w:val="bullet"/>
+      <w:lvlText w:val="o"/>
+      <w:lvlJc w:val="left"/>
+      <w:pPr>
+        <w:ind w:left="1440" w:hanging="360"/>
+      </w:pPr>
+      <w:rPr>
+        <w:rFonts w:ascii="Courier New" w:hAnsi="Courier New" w:cs="Courier New" w:hint="default"/>
+      </w:rPr>
+    </w:lvl>
+    <w:lvl w:ilvl="2" w:tplc="04090005" w:tentative="1">
+      <w:start w:val="1"/>
+      <w:numFmt w:val="bullet"/>
+      <w:lvlText w:val=""/>
+      <w:lvlJc w:val="left"/>
+      <w:pPr>
+        <w:ind w:left="2160" w:hanging="360"/>
+      </w:pPr>
+      <w:rPr>
+        <w:rFonts w:ascii="Wingdings" w:hAnsi="Wingdings" w:hint="default"/>
+      </w:rPr>
+    </w:lvl>
+    <w:lvl w:ilvl="3" w:tplc="04090001" w:tentative="1">
+      <w:start w:val="1"/>
+      <w:numFmt w:val="bullet"/>
+      <w:lvlText w:val=""/>
+      <w:lvlJc w:val="left"/>
+      <w:pPr>
+        <w:ind w:left="2880" w:hanging="360"/>
+      </w:pPr>
+      <w:rPr>
+        <w:rFonts w:ascii="Symbol" w:hAnsi="Symbol" w:hint="default"/>
+      </w:rPr>
+    </w:lvl>
+    <w:lvl w:ilvl="4" w:tplc="04090003" w:tentative="1">
+      <w:start w:val="1"/>
+      <w:numFmt w:val="bullet"/>
+      <w:lvlText w:val="o"/>
+      <w:lvlJc w:val="left"/>
+      <w:pPr>
+        <w:ind w:left="3600" w:hanging="360"/>
+      </w:pPr>
+      <w:rPr>
+        <w:rFonts w:ascii="Courier New" w:hAnsi="Courier New" w:cs="Courier New" w:hint="default"/>
+      </w:rPr>
+    </w:lvl>
+    <w:lvl w:ilvl="5" w:tplc="04090005" w:tentative="1">
+      <w:start w:val="1"/>
+      <w:numFmt w:val="bullet"/>
+      <w:lvlText w:val=""/>
+      <w:lvlJc w:val="left"/>
+      <w:pPr>
+        <w:ind w:left="4320" w:hanging="360"/>
+      </w:pPr>
+      <w:rPr>
+        <w:rFonts w:ascii="Wingdings" w:hAnsi="Wingdings" w:hint="default"/>
+      </w:rPr>
+    </w:lvl>
+    <w:lvl w:ilvl="6" w:tplc="04090001" w:tentative="1">
+      <w:start w:val="1"/>
+      <w:numFmt w:val="bullet"/>
+      <w:lvlText w:val=""/>
+      <w:lvlJc w:val="left"/>
+      <w:pPr>
+        <w:ind w:left="5040" w:hanging="360"/>
+      </w:pPr>
+      <w:rPr>
+        <w:rFonts w:ascii="Symbol" w:hAnsi="Symbol" w:hint="default"/>
+      </w:rPr>
+    </w:lvl>
+    <w:lvl w:ilvl="7" w:tplc="04090003" w:tentative="1">
+      <w:start w:val="1"/>
+      <w:numFmt w:val="bullet"/>
+      <w:lvlText w:val="o"/>
+      <w:lvlJc w:val="left"/>
+      <w:pPr>
+        <w:ind w:left="5760" w:hanging="360"/>
+      </w:pPr>
+      <w:rPr>
+        <w:rFonts w:ascii="Courier New" w:hAnsi="Courier New" w:cs="Courier New" w:hint="default"/>
+      </w:rPr>
+    </w:lvl>
+    <w:lvl w:ilvl="8" w:tplc="04090005" w:tentative="1">
+      <w:start w:val="1"/>
+      <w:numFmt w:val="bullet"/>
+      <w:lvlText w:val=""/>
+      <w:lvlJc w:val="left"/>
+      <w:pPr>
+        <w:ind w:left="6480" w:hanging="360"/>
+      </w:pPr>
+      <w:rPr>
+        <w:rFonts w:ascii="Wingdings" w:hAnsi="Wingdings" w:hint="default"/>
+      </w:rPr>
+    </w:lvl>
+  </w:abstractNum>
+  <w:num w:numId="1" w16cid:durableId="691037001">
+    <w:abstractNumId w:val="0"/>
+  </w:num>
+</w:numbering>
 </file>
 
 <file path=word/styles.xml><?xml version="1.0" encoding="utf-8"?>
@@ -937,6 +1120,17 @@
       <w:szCs w:val="56"/>
     </w:rPr>
   </w:style>
+  <w:style w:type="paragraph" w:styleId="ListParagraph">
+    <w:name w:val="List Paragraph"/>
+    <w:basedOn w:val="Normal"/>
+    <w:uiPriority w:val="34"/>
+    <w:qFormat/>
+    <w:rsid w:val="00BC40FD"/>
+    <w:pPr>
+      <w:ind w:left="720"/>
+      <w:contextualSpacing/>
+    </w:pPr>
+  </w:style>
 </w:styles>
 </file>
 

</xml_diff>